<commit_message>
cohorts 2-4 LANDED (evergreen_pe n=5, nontraded_reit n=3, venture n=3): 249 adversarially-verified cells across 6 products, all 14 at 100% resolved (756/756); ssss strategy-continuity CONFIRMED (Neostellar rename = externalization, new 1.75% gross-assets fee regime typed); SREIT cap-shrink-and-suspension story (2%->0.33%->0.5%->closed) encoded honestly as cap null; jll daily-dealing/quarterly-cap schema; venture triptych: arkvx real selection 8/12, ssss escalates like dxyz, NSLR -21.7% discount = the premium pattern's mirror; annual+quarterly series tiers extended; facts at 14 full mappings; series lazy-split (data.js 1.05MB + 499KB chunk)
Co-Authored-By: Claude Fable 5 <noreply@anthropic.com>
</commit_message>
<xml_diff>
--- a/data/memos/amg_pantheon_decision_memo.docx
+++ b/data/memos/amg_pantheon_decision_memo.docx
@@ -106,7 +106,13 @@
           </w:tcPr>
           <w:p>
             <w:r>
-              <w:t>No cells evaluated yet — pending extraction.</w:t>
+              <w:t>1.1: NAV-based net total return series, fiscal years ended March 31, all five classes printed. Primary class (Class 4, zero distribution fee, inception 09/30/14 = Fund inception, used in the N-CSR performance graph): FY2026 9</w:t>
+              <w:br/>
+              <w:t>1.2: Average annual total returns as of 3/31/2026 (1yr / 5yr / 10yr / since inception, inception date): Class 4: 9.10% / 11.12% / 13.16% / 11.63% (09/30/14); Class 3: 8.88 / 10.84 / 12.87 / 12.50 (10/27/15); Class 2: 8.60 / 1</w:t>
+              <w:br/>
+              <w:t>1.3: PARTIAL: no gross-of-fees RETURN series is printed in any on-disk document - only net total returns. What IS printed is the gross-vs-net EXPENSE-ratio spread, a constant 0.70% for every class every year FY2024-FY2026 (FY</w:t>
+              <w:br/>
+              <w:t>1.4: Distributions declared/paid at least annually; identical per-unit across classes: FY2026 $0.63, FY2025 $0.25, FY2024 $0.17, FY2023 $0.41, FY2022 $0.72 - all from net realized gain on investments. Class 4 ten-year table a</w:t>
             </w:r>
           </w:p>
         </w:tc>
@@ -128,7 +134,13 @@
           </w:tcPr>
           <w:p>
             <w:r>
-              <w:t>No cells evaluated yet — pending extraction.</w:t>
+              <w:t>2.1: RATE: 0.70% annual. BASE: net assets as of the end of each month, determined before accrual of the fee being calculated and before purchases/repurchases/distributions. WHERE CHARGED: paid by the Master Fund AND by each S</w:t>
+              <w:br/>
+              <w:t>2.2: Documented absence at Fund/Master level: the N-2 fee tables for all five classes print only Management Fee, Distribution and/or Service Fee, Other Expenses, and Acquired Fund Fees and Expenses - no incentive or performan</w:t>
+              <w:br/>
+              <w:t>2.3: N-2 fee tables, Total Annual Expenses (as % of net assets attributable to Units): Class 1 3.13%, Class 2 2.88%, Class 3 2.63%, Class 4 2.38%, Class 5 3.38% - each = 0.70% management + 0.75/0.50/0.25/0.00/1.00% distributi</w:t>
+              <w:br/>
+              <w:t xml:space="preserve">2.4: AFFE 0.81% for every class (Class 1 table and Class 2-5 table identical). Reflects operating expenses of the Investment Funds (management fees, administration fees, professional and other direct fixed fees); excludes an </w:t>
             </w:r>
           </w:p>
         </w:tc>
@@ -150,7 +162,13 @@
           </w:tcPr>
           <w:p>
             <w:r>
-              <w:t>No cells evaluated yet — pending extraction.</w:t>
+              <w:t>3.1: Wrapper liquidity: unlisted tender-offer fund; no unitholder redemption right - repurchases only via written tenders at times/amounts/terms set by the Board in its sole discretion. CADENCE: Adviser and Sponsor anticipate</w:t>
+              <w:br/>
+              <w:t>3.2: Mechanics per live offer (SC TO-I filed 2026-08-03): tenders due 11:59 p.m. ET 2026-08-28; purchase price = class NAV as of Valuation Date 2026-09-30 (approx. one month after expiration); payment in cash or a non-interes</w:t>
+              <w:br/>
+              <w:t>3.3: As disclosed (recorded 2026-08-15): live offer (launched 2026-08-03, expires 2026-08-28) for up to 11,957,272 Units, approx. 5% of the 239,145,444 Units outstanding at 5/31/2026. Completed-tender dollars from N-CSR capit</w:t>
+              <w:br/>
+              <w:t xml:space="preserve">3.4: Master Fund holdings attributes table at 3/31/2026: every private investment category 'Not Redeemable', redemption frequency/notice N/A, remaining lives up to 12 years. Fair value $6,079,798,952 across Buyout $4,982.9M, </w:t>
             </w:r>
           </w:p>
         </w:tc>
@@ -172,7 +190,13 @@
           </w:tcPr>
           <w:p>
             <w:r>
-              <w:t>No cells evaluated yet — pending extraction.</w:t>
+              <w:t>4.1: NAV FREQUENCY: monthly - NAV of the Master Fund and each class calculated as of close of business on the last business day of each calendar month, plus any distribution date and other Board-determined times ('Determinati</w:t>
+              <w:br/>
+              <w:t>4.2: Master Fund consolidated hierarchy at 3/31/2026: Level 1 $581,361,401 (common stock $48.1M + short-term other-investment-companies $533.3M); Level 2 $0; Level 3 $325,527,462 (co-investments $315.9M + primary funds $9.7M)</w:t>
+              <w:br/>
+              <w:t xml:space="preserve">4.3: PARTIAL: no independent valuation agent is NAMED and no standing engagement is disclosed. Printed capability only: the Master Fund 'may utilize' independent valuation firms for third-party valuation consulting; N-2 adds </w:t>
+              <w:br/>
+              <w:t>4.4: By asset type (Master Fund Note 1a + L3 quantitative table at 3/31/2026): direct investments/certain co-investments - market or income approach (techniques printed: recent round of financing/option pricing model with ter</w:t>
             </w:r>
           </w:p>
         </w:tc>
@@ -194,7 +218,13 @@
           </w:tcPr>
           <w:p>
             <w:r>
-              <w:t>No cells evaluated yet — pending extraction.</w:t>
+              <w:t>5.1: Self-declared comparison index in the annual report: MSCI World Index - used in both the cumulative-return graph (hypothetical $50,000,000 in Class 4 units vs the index) and the Average Annual Total Returns table (MSCI W</w:t>
+              <w:br/>
+              <w:t>5.3: Candidates evaluated incl. paid/manual indices and the real peer-cohort lane; full scoring + rejection ledger in the selection artifact.</w:t>
+              <w:br/>
+              <w:t>5.4: Peer cohort evergreen_pe (n=5): members, rationales, stats, composite (or its documented refusal) and caveat block in the cohort artifact; exclusions in data/roster_decisions.md.</w:t>
+              <w:br/>
+              <w:t>5.5: PME inputs (computed): window 2016-03-31 to 2026-03-31; flows [-1, 3.4461]; index daily-anchored. KS-PME 2.4551, Direct Alpha 9.4%/yr.</w:t>
             </w:r>
           </w:p>
         </w:tc>
@@ -216,7 +246,13 @@
           </w:tcPr>
           <w:p>
             <w:r>
-              <w:t>No cells evaluated yet — pending extraction.</w:t>
+              <w:t>6.1: Master-feeder: AMG Pantheon Fund, LLC (Delaware LLC, closed-end non-diversified, perpetual term, five unit classes, CIK 1609211) is a feeder investing substantially all assets in AMG Pantheon Master Fund, LLC (affiliate;</w:t>
+              <w:br/>
+              <w:t>6.2: Evergreen private-equity vehicle, objective long-term capital appreciation; strategy mix at 3/31/2026 (Master SOI): secondaries $3,138.2M + co-investments $2,369.1M + primary funds $572.5M + common stock $48.1M + short-t</w:t>
+              <w:br/>
+              <w:t>6.3: Printed conflicts web: AMG (Affiliated Managers Group, Inc.) indirectly owns a majority of the Adviser (Pantheon); the Administrator (AMG Funds LLC, AMG's US wealth platform) and Distributor (AMG Distributors, Inc., whol</w:t>
+              <w:br/>
+              <w:t>6.4: Form 1099-DIV literally printed (Other Tax Information): investors receive Form 1099-DIV showing the tax status of distributions - no K-1. Fund qualifies as a regulated investment company under Subchapter M (tax year end</w:t>
             </w:r>
           </w:p>
         </w:tc>
@@ -231,10 +267,259 @@
       </w:r>
     </w:p>
     <w:p>
+      <w:pPr>
+        <w:pStyle w:val="Heading2"/>
+      </w:pPr>
       <w:r>
-        <w:t>Engine profile pending for this product — extraction depth required before selection.</w:t>
+        <w:t>Primary: Listed private equity investable proxy (PSP) — score 9/12</w:t>
       </w:r>
     </w:p>
+    <w:p>
+      <w:r>
+        <w:t>Window 2016-03-31 to 2026-03-31: fund 13.17%/yr vs benchmark 3.45%/yr; KS-PME 2.4551; Direct Alpha 9.4%/yr. Disclosure: PME and alpha computed on appraisal-lagged NAVs are window-sensitive and can be smoothing-flattered; conclusions should be read with the methodology's window-sensitivity analysis.</w:t>
+      </w:r>
+    </w:p>
+    <w:p>
+      <w:pPr>
+        <w:pStyle w:val="ListBullet"/>
+      </w:pPr>
+      <w:r>
+        <w:t>strategy_match 2/3: listed GPs/holdcos - PE exposure with public-market beta</w:t>
+      </w:r>
+    </w:p>
+    <w:p>
+      <w:pPr>
+        <w:pStyle w:val="ListBullet"/>
+      </w:pPr>
+      <w:r>
+        <w:t>risk_liquidity_match 1/3: daily-liquid proxy vs semi-liquid fund - vol/liquidity regimes differ</w:t>
+      </w:r>
+    </w:p>
+    <w:p>
+      <w:pPr>
+        <w:pStyle w:val="ListBullet"/>
+      </w:pPr>
+      <w:r>
+        <w:t>investability 2/2: investable, priced daily</w:t>
+      </w:r>
+    </w:p>
+    <w:p>
+      <w:pPr>
+        <w:pStyle w:val="ListBullet"/>
+      </w:pPr>
+      <w:r>
+        <w:t>data_quality 2/2: daily series</w:t>
+      </w:r>
+    </w:p>
+    <w:p>
+      <w:pPr>
+        <w:pStyle w:val="ListBullet"/>
+      </w:pPr>
+      <w:r>
+        <w:t>provider_independence 2/2: provider unaffiliated with the fund</w:t>
+      </w:r>
+    </w:p>
+    <w:p>
+      <w:pPr>
+        <w:pStyle w:val="Heading2"/>
+      </w:pPr>
+      <w:r>
+        <w:t>Secondary: MSCI World investable proxy (URTH) — score 8/12</w:t>
+      </w:r>
+    </w:p>
+    <w:p>
+      <w:r>
+        <w:t>Window 2016-03-31 to 2026-03-31: fund 13.17%/yr vs benchmark 8.61%/yr; KS-PME 1.5085; Direct Alpha 4.2%/yr. Disclosure: PME and alpha computed on appraisal-lagged NAVs are window-sensitive and can be smoothing-flattered; conclusions should be read with the methodology's window-sensitivity analysis.</w:t>
+      </w:r>
+    </w:p>
+    <w:p>
+      <w:pPr>
+        <w:pStyle w:val="ListBullet"/>
+      </w:pPr>
+      <w:r>
+        <w:t>strategy_match 1/3: public equities - liquidity/leverage profile differs materially</w:t>
+      </w:r>
+    </w:p>
+    <w:p>
+      <w:pPr>
+        <w:pStyle w:val="ListBullet"/>
+      </w:pPr>
+      <w:r>
+        <w:t>risk_liquidity_match 1/3: daily-liquid proxy vs semi-liquid fund - vol/liquidity regimes differ</w:t>
+      </w:r>
+    </w:p>
+    <w:p>
+      <w:pPr>
+        <w:pStyle w:val="ListBullet"/>
+      </w:pPr>
+      <w:r>
+        <w:t>investability 2/2: investable, priced daily</w:t>
+      </w:r>
+    </w:p>
+    <w:p>
+      <w:pPr>
+        <w:pStyle w:val="ListBullet"/>
+      </w:pPr>
+      <w:r>
+        <w:t>data_quality 2/2: daily series</w:t>
+      </w:r>
+    </w:p>
+    <w:p>
+      <w:pPr>
+        <w:pStyle w:val="ListBullet"/>
+      </w:pPr>
+      <w:r>
+        <w:t>provider_independence 2/2: provider unaffiliated with the fund</w:t>
+      </w:r>
+    </w:p>
+    <w:p>
+      <w:pPr>
+        <w:pStyle w:val="Heading2"/>
+      </w:pPr>
+      <w:r>
+        <w:t>Rejection log (candidates considered and not selected)</w:t>
+      </w:r>
+    </w:p>
+    <w:tbl>
+      <w:tblPr>
+        <w:tblStyle w:val="TableGrid"/>
+        <w:tblW w:type="auto" w:w="0"/>
+        <w:tblLook w:firstColumn="1" w:firstRow="1" w:lastColumn="0" w:lastRow="0" w:noHBand="0" w:noVBand="1" w:val="04A0"/>
+      </w:tblPr>
+      <w:tblGrid>
+        <w:gridCol w:w="3120"/>
+        <w:gridCol w:w="3120"/>
+        <w:gridCol w:w="3120"/>
+      </w:tblGrid>
+      <w:tr>
+        <w:tc>
+          <w:tcPr>
+            <w:tcW w:type="dxa" w:w="3456"/>
+          </w:tcPr>
+          <w:p>
+            <w:r>
+              <w:t>Candidate</w:t>
+            </w:r>
+          </w:p>
+        </w:tc>
+        <w:tc>
+          <w:tcPr>
+            <w:tcW w:type="dxa" w:w="1152"/>
+          </w:tcPr>
+          <w:p>
+            <w:r>
+              <w:t>Score</w:t>
+            </w:r>
+          </w:p>
+        </w:tc>
+        <w:tc>
+          <w:tcPr>
+            <w:tcW w:type="dxa" w:w="4752"/>
+          </w:tcPr>
+          <w:p>
+            <w:r>
+              <w:t>Reason</w:t>
+            </w:r>
+          </w:p>
+        </w:tc>
+      </w:tr>
+      <w:tr>
+        <w:tc>
+          <w:tcPr>
+            <w:tcW w:type="dxa" w:w="3456"/>
+          </w:tcPr>
+          <w:p>
+            <w:r>
+              <w:t>PME / Direct Alpha vs PSP</w:t>
+            </w:r>
+          </w:p>
+        </w:tc>
+        <w:tc>
+          <w:tcPr>
+            <w:tcW w:type="dxa" w:w="1152"/>
+          </w:tcPr>
+          <w:p>
+            <w:r>
+              <w:t>8/12</w:t>
+            </w:r>
+          </w:p>
+        </w:tc>
+        <w:tc>
+          <w:tcPr>
+            <w:tcW w:type="dxa" w:w="4752"/>
+          </w:tcPr>
+          <w:p>
+            <w:r>
+              <w:t>outranked: score 8/12 vs primary 9/12 and secondary 8/12 - only two slots; retained in log as viable alternate</w:t>
+            </w:r>
+          </w:p>
+        </w:tc>
+      </w:tr>
+      <w:tr>
+        <w:tc>
+          <w:tcPr>
+            <w:tcW w:type="dxa" w:w="3456"/>
+          </w:tcPr>
+          <w:p>
+            <w:r>
+              <w:t>Cambridge Associates US PE benchmark</w:t>
+            </w:r>
+          </w:p>
+        </w:tc>
+        <w:tc>
+          <w:tcPr>
+            <w:tcW w:type="dxa" w:w="1152"/>
+          </w:tcPr>
+          <w:p>
+            <w:r>
+              <w:t>7/12</w:t>
+            </w:r>
+          </w:p>
+        </w:tc>
+        <w:tc>
+          <w:tcPr>
+            <w:tcW w:type="dxa" w:w="4752"/>
+          </w:tcPr>
+          <w:p>
+            <w:r>
+              <w:t>outranked: score 7/12 vs primary 9/12 and secondary 8/12 - only two slots; retained in log as viable alternate</w:t>
+            </w:r>
+          </w:p>
+        </w:tc>
+      </w:tr>
+      <w:tr>
+        <w:tc>
+          <w:tcPr>
+            <w:tcW w:type="dxa" w:w="3456"/>
+          </w:tcPr>
+          <w:p>
+            <w:r>
+              <w:t>Peer cohort: evergreen_pe (hl_paf, stepstone_spm, kkr_kpec, ares_pmf, amg_pantheon)</w:t>
+            </w:r>
+          </w:p>
+        </w:tc>
+        <w:tc>
+          <w:tcPr>
+            <w:tcW w:type="dxa" w:w="1152"/>
+          </w:tcPr>
+          <w:p>
+            <w:r>
+              <w:t>7/12</w:t>
+            </w:r>
+          </w:p>
+        </w:tc>
+        <w:tc>
+          <w:tcPr>
+            <w:tcW w:type="dxa" w:w="4752"/>
+          </w:tcPr>
+          <w:p>
+            <w:r>
+              <w:t>outranked: score 7/12 vs primary 9/12 and secondary 8/12 - only two slots; retained in log as viable alternate</w:t>
+            </w:r>
+          </w:p>
+        </w:tc>
+      </w:tr>
+    </w:tbl>
     <w:p>
       <w:pPr>
         <w:pStyle w:val="Heading1"/>
@@ -245,7 +530,7 @@
     </w:p>
     <w:p>
       <w:r>
-        <w:t>Every populated cell carries its source document, section, quote, extractor and verifier in data/evidence/. Current cell status for this product: pending: 54. Cells marked extracted-unverified or computed await independent verification; verified cells have been independently re-checked.</w:t>
+        <w:t>Every populated cell carries its source document, section, quote, extractor and verifier in data/evidence/. Current cell status for this product: computed: 8, extracted: 27, fetched: 1, n/a: 16, partial: 2. Cells marked extracted-unverified or computed await independent verification; verified cells have been independently re-checked.</w:t>
       </w:r>
     </w:p>
     <w:p>

</xml_diff>

<commit_message>
cohort UX + kit: cohort pages (ranges/composite-or-refusal/rationales/exclusion log), screener cohort+depth filters @14, compare peer-suggest + auto cross-wrapper caveats, DXYZ/NSLR premium-pattern exhibit, palette cohort commands, memo cohort-placement section, 2.9 cohort placement for all 14 (R4-phrased), verification queue extension, e2e 110 checks incl. R4 bundle sweep, series lazy-split, 14 screenshots, demo v5, BUILD_REPORT_4
Co-Authored-By: Claude Fable 5 <noreply@anthropic.com>
</commit_message>
<xml_diff>
--- a/data/memos/amg_pantheon_decision_memo.docx
+++ b/data/memos/amg_pantheon_decision_memo.docx
@@ -525,6 +525,69 @@
         <w:pStyle w:val="Heading1"/>
       </w:pPr>
       <w:r>
+        <w:t>Peer cohort placement</w:t>
+      </w:r>
+    </w:p>
+    <w:p>
+      <w:r>
+        <w:t>Evidence depth tier: COHORT. Cohort: Evergreen private equity ('40-Act funds + '34-Act conglomerate) (n=5). Membership rationale: Evergreen PE (Pantheon) tender-offer LLC - wrapper and strategy twin of hl_paf/stepstone_spm.</w:t>
+      </w:r>
+    </w:p>
+    <w:p>
+      <w:r>
+        <w:t>Cohort placement (evergreen_pe, R4 phrasing): mgmt fee: 10th percentile of cohort (n=5), below the median of 1.4 | expense ratio (bases differ - see notes): 30th percentile of cohort (n=5), below the median of 3.19 | repurchase cap: 12th percentile of cohort (n=4), at the median of 5. Stats + caveats in the cohort artifact.</w:t>
+      </w:r>
+    </w:p>
+    <w:p>
+      <w:pPr>
+        <w:pStyle w:val="ListBullet"/>
+      </w:pPr>
+      <w:r>
+        <w:t>Caveat: PRICING-BASIS MIX: some members transact at NAV, others at exchange market price - return comparisons mix appraisal dynamics with premium/discount dynamics; composites across this line are refused, not averaged. [amg_pantheon: NAV; ares_pmf: NAV; hl_paf: NAV; kkr_kpec: transactional NAV; stepstone_spm: NAV]</w:t>
+      </w:r>
+    </w:p>
+    <w:p>
+      <w:pPr>
+        <w:pStyle w:val="ListBullet"/>
+      </w:pPr>
+      <w:r>
+        <w:t>Caveat: LEVERAGE-REGIME MIX: BDC 150% coverage and non-1940-Act wrappers allow materially more leverage than 1940-Act funds - fee bases and return volatility are not like-for-like. [amg_pantheon: 1940-Act asset-coverage limits; ares_pmf: 1940-Act asset-coverage limits; hl_paf: 1940-Act asset-coverage limits; kkr_kpec: no 1940-Act leverage limits (34-Act conglomerate); stepstone_spm: 1940-Act asset-coverage limits]</w:t>
+      </w:r>
+    </w:p>
+    <w:p>
+      <w:pPr>
+        <w:pStyle w:val="ListBullet"/>
+      </w:pPr>
+      <w:r>
+        <w:t>Caveat: LIQUIDITY-LAW MIX: Rule 23c-3 obligations, discretionary tenders, and repurchase plans give different worst-case exit rights; cadence numbers alone overstate comparability. [amg_pantheon: board-DISCRETIONARY tender offers (nothing compels the next one); ares_pmf: board-DISCRETIONARY tender offers (nothing compels the next one); hl_paf: board-DISCRETIONARY tender offers (nothing compels the next one); kkr_kpec: board-discretionary share repurchases; stepstone_spm: board-DISCRETIONARY tender offers (nothing compels the next one)]</w:t>
+      </w:r>
+    </w:p>
+    <w:p>
+      <w:pPr>
+        <w:pStyle w:val="ListBullet"/>
+      </w:pPr>
+      <w:r>
+        <w:t>Caveat: NAV-CADENCE MIX: daily, monthly, and quarterly NAV processes embed different appraisal smoothing; volatility and drawdown comparisons inherit that difference (see de-smoothing lab). [amg_pantheon: daily-to-monthly NAV; ares_pmf: daily-to-monthly NAV; hl_paf: daily-to-monthly NAV; kkr_kpec: monthly transactional NAV; stepstone_spm: daily-to-monthly NAV]</w:t>
+      </w:r>
+    </w:p>
+    <w:p>
+      <w:pPr>
+        <w:pStyle w:val="ListBullet"/>
+      </w:pPr>
+      <w:r>
+        <w:t>Caveat: kkr_kpec joins under the authorized fallback: its structural twins are Reg D vehicles with no public filings (data/roster_decisions.md - 'The kkr_kpec ruling'). Cross-wrapper caveats apply.</w:t>
+      </w:r>
+    </w:p>
+    <w:p>
+      <w:r>
+        <w:t>Cohort exclusion log: every candidate considered and not admitted is recorded with its reason in data/roster_decisions.md (rendered on the site's Cohorts view). Membership is an argued judgment, not a tag.</w:t>
+      </w:r>
+    </w:p>
+    <w:p>
+      <w:pPr>
+        <w:pStyle w:val="Heading1"/>
+      </w:pPr>
+      <w:r>
         <w:t>Provenance</w:t>
       </w:r>
     </w:p>

</xml_diff>